<commit_message>
docs(macos): clarify first-run security prompts
</commit_message>
<xml_diff>
--- a/docs/MACOS_FRIEND_QUICK_START.docx
+++ b/docs/MACOS_FRIEND_QUICK_START.docx
@@ -264,7 +264,37 @@
           <w:color w:val="333333"/>
           <w:sz w:val="21"/>
         </w:rPr>
-        <w:t>如果系统阻止打开，请在 Finder 中右键文件，选择“打开”，再确认一次。</w:t>
+        <w:t>如果看到“未打开 install-macos.command”或“Apple 无法验证”，这是 Gatekeeper 对未做 Apple 开发者签名的脚本进行首次确认。不要点击“移到废纸篓”。</w:t>
+      </w:r>
+    </w:p>
+    <w:p>
+      <w:pPr>
+        <w:pStyle w:val="ListBullet"/>
+        <w:spacing w:after="40"/>
+      </w:pPr>
+      <w:r>
+        <w:rPr>
+          <w:rFonts w:ascii="Microsoft YaHei" w:hAnsi="Microsoft YaHei" w:eastAsia="Microsoft YaHei"/>
+          <w:b w:val="0"/>
+          <w:color w:val="333333"/>
+          <w:sz w:val="21"/>
+        </w:rPr>
+        <w:t>在 Finder 中右键 install-macos.command，选择“打开”，再在系统提示中选择“打开”。</w:t>
+      </w:r>
+    </w:p>
+    <w:p>
+      <w:pPr>
+        <w:pStyle w:val="ListBullet"/>
+        <w:spacing w:after="40"/>
+      </w:pPr>
+      <w:r>
+        <w:rPr>
+          <w:rFonts w:ascii="Microsoft YaHei" w:hAnsi="Microsoft YaHei" w:eastAsia="Microsoft YaHei"/>
+          <w:b w:val="0"/>
+          <w:color w:val="333333"/>
+          <w:sz w:val="21"/>
+        </w:rPr>
+        <w:t>如果仍被拦截，打开“系统设置 → 隐私与安全性”，在“安全性”区域找到 install-macos.command，点击“仍要打开”并按提示确认。</w:t>
       </w:r>
     </w:p>
     <w:p>
@@ -279,7 +309,7 @@
           <w:color w:val="333333"/>
           <w:sz w:val="21"/>
         </w:rPr>
-        <w:t>如果提示没有执行权限，在 Terminal 中进入解压目录后执行一次：</w:t>
+        <w:t>如果看到“文件无法执行，因为你没有正确的访问权限”，说明解压或微信传输时没有保留执行权限。在 Terminal 中进入解压目录后执行：</w:t>
       </w:r>
     </w:p>
     <w:p>
@@ -293,7 +323,35 @@
           <w:color w:val="202020"/>
           <w:sz w:val="19"/>
         </w:rPr>
-        <w:t>chmod +x macos/install-macos.command macos/install-macos.sh</w:t>
+        <w:t>cd ~/Downloads/DeepSeekHarness-macOS-Validation-M5</w:t>
+      </w:r>
+    </w:p>
+    <w:p>
+      <w:pPr>
+        <w:spacing w:after="80"/>
+      </w:pPr>
+      <w:r>
+        <w:rPr>
+          <w:rFonts w:ascii="Consolas" w:hAnsi="Consolas" w:eastAsia="Consolas"/>
+          <w:b w:val="0"/>
+          <w:color w:val="202020"/>
+          <w:sz w:val="19"/>
+        </w:rPr>
+        <w:t>chmod u+x macos/*.command macos/*.sh</w:t>
+      </w:r>
+    </w:p>
+    <w:p>
+      <w:pPr>
+        <w:spacing w:after="80" w:line="269" w:lineRule="auto"/>
+      </w:pPr>
+      <w:r>
+        <w:rPr>
+          <w:rFonts w:ascii="Microsoft YaHei" w:hAnsi="Microsoft YaHei" w:eastAsia="Microsoft YaHei"/>
+          <w:b w:val="0"/>
+          <w:color w:val="333333"/>
+          <w:sz w:val="21"/>
+        </w:rPr>
+        <w:t>如果解压目录不在“下载”中，先输入 cd （末尾保留空格），再把解压后的文件夹拖入 Terminal，按回车，然后执行第二行 chmod 命令。完成后回到 Finder，再次双击 install-macos.command，必要时重复一次“右键 → 打开”。</w:t>
       </w:r>
     </w:p>
     <w:p>
@@ -307,12 +365,7 @@
           <w:color w:val="333333"/>
           <w:sz w:val="21"/>
         </w:rPr>
-        <w:t>然后再次双击 install-macos.command。通常不需要管理员权限。</w:t>
-      </w:r>
-    </w:p>
-    <w:p>
-      <w:r>
-        <w:br w:type="page"/>
+        <w:t>上述操作只恢复本项目文件的执行权限，不会关闭 Gatekeeper、系统安全软件或防火墙，也通常不需要管理员权限。</w:t>
       </w:r>
     </w:p>
     <w:p>

</xml_diff>